<commit_message>
Add PBAST10 logo to abstract template
</commit_message>
<xml_diff>
--- a/assets/documents/PBAST10_Abstract_Template.docx
+++ b/assets/documents/PBAST10_Abstract_Template.docx
@@ -503,19 +503,113 @@
     <w:pPr>
       <w:pStyle w:val="Header"/>
       <w:spacing w:after="0"/>
+    </w:pPr>
+  </w:p>
+  <w:tbl>
+    <w:tblPr>
+      <w:tblW w:type="auto" w:w="0"/>
       <w:jc w:val="center"/>
-    </w:pPr>
-    <w:r>
-      <w:rPr>
-        <w:rFonts w:ascii="Times New Roman" w:hAnsi="Times New Roman" w:eastAsia="Times New Roman"/>
-        <w:b/>
-        <w:i w:val="0"/>
-        <w:color w:val="003876"/>
-        <w:sz w:val="18"/>
-      </w:rPr>
-      <w:t>PBAST10 Abstract Template</w:t>
-    </w:r>
-  </w:p>
+      <w:tblLayout w:type="fixed"/>
+      <w:tblLook w:firstColumn="1" w:firstRow="1" w:lastColumn="0" w:lastRow="0" w:noHBand="0" w:noVBand="1" w:val="04A0"/>
+    </w:tblPr>
+    <w:tblGrid>
+      <w:gridCol w:w="3024"/>
+      <w:gridCol w:w="3024"/>
+      <w:gridCol w:w="3024"/>
+    </w:tblGrid>
+    <w:tr>
+      <w:tc>
+        <w:tcPr>
+          <w:tcW w:type="dxa" w:w="1701"/>
+          <w:tcMar>
+            <w:top w:w="0" w:type="dxa"/>
+            <w:start w:w="0" w:type="dxa"/>
+            <w:bottom w:w="0" w:type="dxa"/>
+            <w:end w:w="0" w:type="dxa"/>
+          </w:tcMar>
+        </w:tcPr>
+        <w:p>
+          <w:pPr>
+            <w:spacing w:after="0"/>
+            <w:jc w:val="left"/>
+          </w:pPr>
+          <w:r>
+            <w:drawing>
+              <wp:inline xmlns:a="http://schemas.openxmlformats.org/drawingml/2006/main" xmlns:pic="http://schemas.openxmlformats.org/drawingml/2006/picture">
+                <wp:extent cx="900000" cy="351562"/>
+                <wp:docPr id="1" name="Picture 1"/>
+                <wp:cNvGraphicFramePr>
+                  <a:graphicFrameLocks noChangeAspect="1"/>
+                </wp:cNvGraphicFramePr>
+                <a:graphic>
+                  <a:graphicData uri="http://schemas.openxmlformats.org/drawingml/2006/picture">
+                    <pic:pic>
+                      <pic:nvPicPr>
+                        <pic:cNvPr id="0" name="pbast10-logo.png"/>
+                        <pic:cNvPicPr/>
+                      </pic:nvPicPr>
+                      <pic:blipFill>
+                        <a:blip r:embed="rId1"/>
+                        <a:stretch>
+                          <a:fillRect/>
+                        </a:stretch>
+                      </pic:blipFill>
+                      <pic:spPr>
+                        <a:xfrm>
+                          <a:off x="0" y="0"/>
+                          <a:ext cx="900000" cy="351562"/>
+                        </a:xfrm>
+                        <a:prstGeom prst="rect"/>
+                      </pic:spPr>
+                    </pic:pic>
+                  </a:graphicData>
+                </a:graphic>
+              </wp:inline>
+            </w:drawing>
+          </w:r>
+        </w:p>
+      </w:tc>
+      <w:tc>
+        <w:tcPr>
+          <w:tcW w:type="dxa" w:w="5669"/>
+          <w:tcMar>
+            <w:top w:w="0" w:type="dxa"/>
+            <w:start w:w="0" w:type="dxa"/>
+            <w:bottom w:w="0" w:type="dxa"/>
+            <w:end w:w="0" w:type="dxa"/>
+          </w:tcMar>
+        </w:tcPr>
+        <w:p>
+          <w:pPr>
+            <w:spacing w:after="0"/>
+            <w:jc w:val="center"/>
+          </w:pPr>
+          <w:r>
+            <w:rPr>
+              <w:rFonts w:ascii="Times New Roman" w:hAnsi="Times New Roman" w:eastAsia="Times New Roman"/>
+              <w:b/>
+              <w:i w:val="0"/>
+              <w:color w:val="003876"/>
+              <w:sz w:val="18"/>
+            </w:rPr>
+            <w:t>PBAST10 Abstract Template</w:t>
+          </w:r>
+        </w:p>
+      </w:tc>
+      <w:tc>
+        <w:tcPr>
+          <w:tcW w:type="dxa" w:w="1701"/>
+          <w:tcMar>
+            <w:top w:w="0" w:type="dxa"/>
+            <w:start w:w="0" w:type="dxa"/>
+            <w:bottom w:w="0" w:type="dxa"/>
+            <w:end w:w="0" w:type="dxa"/>
+          </w:tcMar>
+        </w:tcPr>
+        <w:p/>
+      </w:tc>
+    </w:tr>
+  </w:tbl>
 </w:hdr>
 </file>
 

</xml_diff>

<commit_message>
Embed logo in abstract template body
</commit_message>
<xml_diff>
--- a/assets/documents/PBAST10_Abstract_Template.docx
+++ b/assets/documents/PBAST10_Abstract_Template.docx
@@ -2,6 +2,111 @@
 <file path=word/document.xml><?xml version="1.0" encoding="utf-8"?>
 <w:document xmlns:wpc="http://schemas.microsoft.com/office/word/2010/wordprocessingCanvas" xmlns:mo="http://schemas.microsoft.com/office/mac/office/2008/main" xmlns:mc="http://schemas.openxmlformats.org/markup-compatibility/2006" xmlns:mv="urn:schemas-microsoft-com:mac:vml" xmlns:o="urn:schemas-microsoft-com:office:office" xmlns:r="http://schemas.openxmlformats.org/officeDocument/2006/relationships" xmlns:m="http://schemas.openxmlformats.org/officeDocument/2006/math" xmlns:v="urn:schemas-microsoft-com:vml" xmlns:wp14="http://schemas.microsoft.com/office/word/2010/wordprocessingDrawing" xmlns:wp="http://schemas.openxmlformats.org/drawingml/2006/wordprocessingDrawing" xmlns:w10="urn:schemas-microsoft-com:office:word" xmlns:w="http://schemas.openxmlformats.org/wordprocessingml/2006/main" xmlns:w14="http://schemas.microsoft.com/office/word/2010/wordml" xmlns:wpg="http://schemas.microsoft.com/office/word/2010/wordprocessingGroup" xmlns:wpi="http://schemas.microsoft.com/office/word/2010/wordprocessingInk" xmlns:wne="http://schemas.microsoft.com/office/word/2006/wordml" xmlns:wps="http://schemas.microsoft.com/office/word/2010/wordprocessingShape" mc:Ignorable="w14 wp14">
   <w:body>
+    <w:tbl>
+      <w:tblPr>
+        <w:tblW w:type="auto" w:w="0"/>
+        <w:jc w:val="center"/>
+        <w:tblLayout w:type="fixed"/>
+        <w:tblLook w:firstColumn="1" w:firstRow="1" w:lastColumn="0" w:lastRow="0" w:noHBand="0" w:noVBand="1" w:val="04A0"/>
+      </w:tblPr>
+      <w:tblGrid>
+        <w:gridCol w:w="3024"/>
+        <w:gridCol w:w="3024"/>
+        <w:gridCol w:w="3024"/>
+      </w:tblGrid>
+      <w:tr>
+        <w:tc>
+          <w:tcPr>
+            <w:tcW w:type="dxa" w:w="1701"/>
+            <w:tcMar>
+              <w:top w:w="0" w:type="dxa"/>
+              <w:start w:w="0" w:type="dxa"/>
+              <w:bottom w:w="0" w:type="dxa"/>
+              <w:end w:w="0" w:type="dxa"/>
+            </w:tcMar>
+          </w:tcPr>
+          <w:p>
+            <w:pPr>
+              <w:spacing w:after="0"/>
+              <w:jc w:val="left"/>
+            </w:pPr>
+            <w:r>
+              <w:drawing>
+                <wp:inline xmlns:a="http://schemas.openxmlformats.org/drawingml/2006/main" xmlns:pic="http://schemas.openxmlformats.org/drawingml/2006/picture">
+                  <wp:extent cx="900000" cy="351562"/>
+                  <wp:docPr id="1" name="Picture 1"/>
+                  <wp:cNvGraphicFramePr>
+                    <a:graphicFrameLocks noChangeAspect="1"/>
+                  </wp:cNvGraphicFramePr>
+                  <a:graphic>
+                    <a:graphicData uri="http://schemas.openxmlformats.org/drawingml/2006/picture">
+                      <pic:pic>
+                        <pic:nvPicPr>
+                          <pic:cNvPr id="0" name="pbast10-logo.png"/>
+                          <pic:cNvPicPr/>
+                        </pic:nvPicPr>
+                        <pic:blipFill>
+                          <a:blip r:embed="rId11"/>
+                          <a:stretch>
+                            <a:fillRect/>
+                          </a:stretch>
+                        </pic:blipFill>
+                        <pic:spPr>
+                          <a:xfrm>
+                            <a:off x="0" y="0"/>
+                            <a:ext cx="900000" cy="351562"/>
+                          </a:xfrm>
+                          <a:prstGeom prst="rect"/>
+                        </pic:spPr>
+                      </pic:pic>
+                    </a:graphicData>
+                  </a:graphic>
+                </wp:inline>
+              </w:drawing>
+            </w:r>
+          </w:p>
+        </w:tc>
+        <w:tc>
+          <w:tcPr>
+            <w:tcW w:type="dxa" w:w="5669"/>
+            <w:tcMar>
+              <w:top w:w="0" w:type="dxa"/>
+              <w:start w:w="0" w:type="dxa"/>
+              <w:bottom w:w="0" w:type="dxa"/>
+              <w:end w:w="0" w:type="dxa"/>
+            </w:tcMar>
+          </w:tcPr>
+          <w:p>
+            <w:pPr>
+              <w:spacing w:after="0"/>
+              <w:jc w:val="center"/>
+            </w:pPr>
+            <w:r>
+              <w:rPr>
+                <w:rFonts w:ascii="Times New Roman" w:hAnsi="Times New Roman" w:eastAsia="Times New Roman"/>
+                <w:b/>
+                <w:i w:val="0"/>
+                <w:color w:val="003876"/>
+                <w:sz w:val="18"/>
+              </w:rPr>
+              <w:t>PBAST10 Abstract Template</w:t>
+            </w:r>
+          </w:p>
+        </w:tc>
+        <w:tc>
+          <w:tcPr>
+            <w:tcW w:type="dxa" w:w="1701"/>
+            <w:tcMar>
+              <w:top w:w="0" w:type="dxa"/>
+              <w:start w:w="0" w:type="dxa"/>
+              <w:bottom w:w="0" w:type="dxa"/>
+              <w:end w:w="0" w:type="dxa"/>
+            </w:tcMar>
+          </w:tcPr>
+          <w:p/>
+        </w:tc>
+      </w:tr>
+    </w:tbl>
     <w:p>
       <w:pPr>
         <w:spacing w:before="0" w:after="40" w:line="240" w:lineRule="auto"/>
@@ -505,111 +610,6 @@
       <w:spacing w:after="0"/>
     </w:pPr>
   </w:p>
-  <w:tbl>
-    <w:tblPr>
-      <w:tblW w:type="auto" w:w="0"/>
-      <w:jc w:val="center"/>
-      <w:tblLayout w:type="fixed"/>
-      <w:tblLook w:firstColumn="1" w:firstRow="1" w:lastColumn="0" w:lastRow="0" w:noHBand="0" w:noVBand="1" w:val="04A0"/>
-    </w:tblPr>
-    <w:tblGrid>
-      <w:gridCol w:w="3024"/>
-      <w:gridCol w:w="3024"/>
-      <w:gridCol w:w="3024"/>
-    </w:tblGrid>
-    <w:tr>
-      <w:tc>
-        <w:tcPr>
-          <w:tcW w:type="dxa" w:w="1701"/>
-          <w:tcMar>
-            <w:top w:w="0" w:type="dxa"/>
-            <w:start w:w="0" w:type="dxa"/>
-            <w:bottom w:w="0" w:type="dxa"/>
-            <w:end w:w="0" w:type="dxa"/>
-          </w:tcMar>
-        </w:tcPr>
-        <w:p>
-          <w:pPr>
-            <w:spacing w:after="0"/>
-            <w:jc w:val="left"/>
-          </w:pPr>
-          <w:r>
-            <w:drawing>
-              <wp:inline xmlns:a="http://schemas.openxmlformats.org/drawingml/2006/main" xmlns:pic="http://schemas.openxmlformats.org/drawingml/2006/picture">
-                <wp:extent cx="900000" cy="351562"/>
-                <wp:docPr id="1" name="Picture 1"/>
-                <wp:cNvGraphicFramePr>
-                  <a:graphicFrameLocks noChangeAspect="1"/>
-                </wp:cNvGraphicFramePr>
-                <a:graphic>
-                  <a:graphicData uri="http://schemas.openxmlformats.org/drawingml/2006/picture">
-                    <pic:pic>
-                      <pic:nvPicPr>
-                        <pic:cNvPr id="0" name="pbast10-logo.png"/>
-                        <pic:cNvPicPr/>
-                      </pic:nvPicPr>
-                      <pic:blipFill>
-                        <a:blip r:embed="rId1"/>
-                        <a:stretch>
-                          <a:fillRect/>
-                        </a:stretch>
-                      </pic:blipFill>
-                      <pic:spPr>
-                        <a:xfrm>
-                          <a:off x="0" y="0"/>
-                          <a:ext cx="900000" cy="351562"/>
-                        </a:xfrm>
-                        <a:prstGeom prst="rect"/>
-                      </pic:spPr>
-                    </pic:pic>
-                  </a:graphicData>
-                </a:graphic>
-              </wp:inline>
-            </w:drawing>
-          </w:r>
-        </w:p>
-      </w:tc>
-      <w:tc>
-        <w:tcPr>
-          <w:tcW w:type="dxa" w:w="5669"/>
-          <w:tcMar>
-            <w:top w:w="0" w:type="dxa"/>
-            <w:start w:w="0" w:type="dxa"/>
-            <w:bottom w:w="0" w:type="dxa"/>
-            <w:end w:w="0" w:type="dxa"/>
-          </w:tcMar>
-        </w:tcPr>
-        <w:p>
-          <w:pPr>
-            <w:spacing w:after="0"/>
-            <w:jc w:val="center"/>
-          </w:pPr>
-          <w:r>
-            <w:rPr>
-              <w:rFonts w:ascii="Times New Roman" w:hAnsi="Times New Roman" w:eastAsia="Times New Roman"/>
-              <w:b/>
-              <w:i w:val="0"/>
-              <w:color w:val="003876"/>
-              <w:sz w:val="18"/>
-            </w:rPr>
-            <w:t>PBAST10 Abstract Template</w:t>
-          </w:r>
-        </w:p>
-      </w:tc>
-      <w:tc>
-        <w:tcPr>
-          <w:tcW w:type="dxa" w:w="1701"/>
-          <w:tcMar>
-            <w:top w:w="0" w:type="dxa"/>
-            <w:start w:w="0" w:type="dxa"/>
-            <w:bottom w:w="0" w:type="dxa"/>
-            <w:end w:w="0" w:type="dxa"/>
-          </w:tcMar>
-        </w:tcPr>
-        <w:p/>
-      </w:tc>
-    </w:tr>
-  </w:tbl>
 </w:hdr>
 </file>
 

</xml_diff>

<commit_message>
Refine abstract template masthead
</commit_message>
<xml_diff>
--- a/assets/documents/PBAST10_Abstract_Template.docx
+++ b/assets/documents/PBAST10_Abstract_Template.docx
@@ -10,14 +10,14 @@
         <w:tblLook w:firstColumn="1" w:firstRow="1" w:lastColumn="0" w:lastRow="0" w:noHBand="0" w:noVBand="1" w:val="04A0"/>
       </w:tblPr>
       <w:tblGrid>
-        <w:gridCol w:w="3024"/>
-        <w:gridCol w:w="3024"/>
-        <w:gridCol w:w="3024"/>
+        <w:gridCol w:w="4536"/>
+        <w:gridCol w:w="4536"/>
       </w:tblGrid>
       <w:tr>
         <w:tc>
           <w:tcPr>
-            <w:tcW w:type="dxa" w:w="1701"/>
+            <w:tcW w:type="dxa" w:w="3005"/>
+            <w:vAlign w:val="center"/>
             <w:tcMar>
               <w:top w:w="0" w:type="dxa"/>
               <w:start w:w="0" w:type="dxa"/>
@@ -33,7 +33,7 @@
             <w:r>
               <w:drawing>
                 <wp:inline xmlns:a="http://schemas.openxmlformats.org/drawingml/2006/main" xmlns:pic="http://schemas.openxmlformats.org/drawingml/2006/picture">
-                  <wp:extent cx="900000" cy="351562"/>
+                  <wp:extent cx="1800000" cy="703125"/>
                   <wp:docPr id="1" name="Picture 1"/>
                   <wp:cNvGraphicFramePr>
                     <a:graphicFrameLocks noChangeAspect="1"/>
@@ -54,7 +54,7 @@
                         <pic:spPr>
                           <a:xfrm>
                             <a:off x="0" y="0"/>
-                            <a:ext cx="900000" cy="351562"/>
+                            <a:ext cx="1800000" cy="703125"/>
                           </a:xfrm>
                           <a:prstGeom prst="rect"/>
                         </pic:spPr>
@@ -68,7 +68,8 @@
         </w:tc>
         <w:tc>
           <w:tcPr>
-            <w:tcW w:type="dxa" w:w="5669"/>
+            <w:tcW w:type="dxa" w:w="6066"/>
+            <w:vAlign w:val="center"/>
             <w:tcMar>
               <w:top w:w="0" w:type="dxa"/>
               <w:start w:w="0" w:type="dxa"/>
@@ -78,8 +79,8 @@
           </w:tcPr>
           <w:p>
             <w:pPr>
-              <w:spacing w:after="0"/>
-              <w:jc w:val="center"/>
+              <w:spacing w:after="40"/>
+              <w:jc w:val="left"/>
             </w:pPr>
             <w:r>
               <w:rPr>
@@ -87,57 +88,35 @@
                 <w:b/>
                 <w:i w:val="0"/>
                 <w:color w:val="003876"/>
-                <w:sz w:val="18"/>
+                <w:sz w:val="21"/>
               </w:rPr>
-              <w:t>PBAST10 Abstract Template</w:t>
+              <w:t>10th Pacific Basin Conference on Adsorption Science &amp; Technology</w:t>
             </w:r>
           </w:p>
-        </w:tc>
-        <w:tc>
-          <w:tcPr>
-            <w:tcW w:type="dxa" w:w="1701"/>
-            <w:tcMar>
-              <w:top w:w="0" w:type="dxa"/>
-              <w:start w:w="0" w:type="dxa"/>
-              <w:bottom w:w="0" w:type="dxa"/>
-              <w:end w:w="0" w:type="dxa"/>
-            </w:tcMar>
-          </w:tcPr>
-          <w:p/>
+          <w:p>
+            <w:pPr>
+              <w:spacing w:after="0"/>
+              <w:jc w:val="left"/>
+            </w:pPr>
+            <w:r>
+              <w:rPr>
+                <w:rFonts w:ascii="Times New Roman" w:hAnsi="Times New Roman" w:eastAsia="Times New Roman"/>
+                <w:b w:val="0"/>
+                <w:i w:val="0"/>
+                <w:color w:val="555555"/>
+                <w:sz w:val="19"/>
+              </w:rPr>
+              <w:t>May 31–June 3, 2027 · Yonsei University · Seoul, Republic of Korea</w:t>
+            </w:r>
+          </w:p>
         </w:tc>
       </w:tr>
     </w:tbl>
     <w:p>
       <w:pPr>
-        <w:spacing w:before="0" w:after="40" w:line="240" w:lineRule="auto"/>
-        <w:jc w:val="center"/>
+        <w:spacing w:before="0" w:after="160" w:line="240" w:lineRule="auto"/>
+        <w:jc w:val="left"/>
       </w:pPr>
-      <w:r>
-        <w:rPr>
-          <w:rFonts w:ascii="Times New Roman" w:hAnsi="Times New Roman" w:eastAsia="Times New Roman"/>
-          <w:b/>
-          <w:i w:val="0"/>
-          <w:color w:val="003876"/>
-          <w:sz w:val="22"/>
-        </w:rPr>
-        <w:t>10th Pacific Basin Conference on Adsorption Science &amp; Technology</w:t>
-      </w:r>
-    </w:p>
-    <w:p>
-      <w:pPr>
-        <w:spacing w:before="0" w:after="200" w:line="240" w:lineRule="auto"/>
-        <w:jc w:val="center"/>
-      </w:pPr>
-      <w:r>
-        <w:rPr>
-          <w:rFonts w:ascii="Times New Roman" w:hAnsi="Times New Roman" w:eastAsia="Times New Roman"/>
-          <w:b w:val="0"/>
-          <w:i w:val="0"/>
-          <w:color w:val="555555"/>
-          <w:sz w:val="19"/>
-        </w:rPr>
-        <w:t>May 31–June 3, 2027 · Yonsei University · Seoul, Republic of Korea</w:t>
-      </w:r>
     </w:p>
     <w:p>
       <w:pPr>

</xml_diff>